<commit_message>
Document quick test profiles and refine narrow-screen sign-in cards
</commit_message>
<xml_diff>
--- a/docs/submission_guide.docx
+++ b/docs/submission_guide.docx
@@ -75,7 +75,49 @@
         <w:widowControl/>
       </w:pPr>
       <w:r>
-        <w:t xml:space="preserve">Private synthetic profile passwords are stored only in the ignored</w:t>
+        <w:t xml:space="preserve">The login page has</w:t>
+      </w:r>
+      <w:r>
+        <w:t xml:space="preserve"> </w:t>
+      </w:r>
+      <w:r>
+        <w:rPr>
+          <w:b/>
+          <w:bCs/>
+        </w:rPr>
+        <w:t xml:space="preserve">Quick test sign-in</w:t>
+      </w:r>
+      <w:r>
+        <w:t xml:space="preserve">: choose</w:t>
+      </w:r>
+      <w:r>
+        <w:t xml:space="preserve"> </w:t>
+      </w:r>
+      <w:r>
+        <w:rPr>
+          <w:b/>
+          <w:bCs/>
+        </w:rPr>
+        <w:t xml:space="preserve">User 1 · Sai</w:t>
+      </w:r>
+      <w:r>
+        <w:t xml:space="preserve"> </w:t>
+      </w:r>
+      <w:r>
+        <w:t xml:space="preserve">or</w:t>
+      </w:r>
+      <w:r>
+        <w:t xml:space="preserve"> </w:t>
+      </w:r>
+      <w:r>
+        <w:rPr>
+          <w:b/>
+          <w:bCs/>
+        </w:rPr>
+        <w:t xml:space="preserve">User 2 · Siddhardth</w:t>
+      </w:r>
+      <w:r>
+        <w:t xml:space="preserve">, with no password needed. Use a normal Chrome window for Sai and an Incognito window for Siddhardth so their cookies stay separate. Both are shared simulated test profiles. Regular registrations still use passwords; private fallback test credentials remain only in ignored</w:t>
       </w:r>
       <w:r>
         <w:t xml:space="preserve"> </w:t>
@@ -90,34 +132,7 @@
         <w:t xml:space="preserve"> </w:t>
       </w:r>
       <w:r>
-        <w:t xml:space="preserve">on the setup Mac. Open that file privately to sign in as</w:t>
-      </w:r>
-      <w:r>
-        <w:t xml:space="preserve"> </w:t>
-      </w:r>
-      <w:r>
-        <w:rPr>
-          <w:rStyle w:val="VerbatimChar"/>
-        </w:rPr>
-        <w:t xml:space="preserve">sai</w:t>
-      </w:r>
-      <w:r>
-        <w:t xml:space="preserve"> </w:t>
-      </w:r>
-      <w:r>
-        <w:t xml:space="preserve">and</w:t>
-      </w:r>
-      <w:r>
-        <w:t xml:space="preserve"> </w:t>
-      </w:r>
-      <w:r>
-        <w:rPr>
-          <w:rStyle w:val="VerbatimChar"/>
-        </w:rPr>
-        <w:t xml:space="preserve">siddhardth</w:t>
-      </w:r>
-      <w:r>
-        <w:t xml:space="preserve">. Do not put it in the submission, show it on video, or use the public local-only demo password on the hosted app. Use a normal Chrome window for Sai and an Incognito window for Siddhardth so their cookies stay separate.</w:t>
+        <w:t xml:space="preserve">and must not appear in the submission or video.</w:t>
       </w:r>
     </w:p>
     <w:p>
@@ -1136,7 +1151,7 @@
         </w:numPr>
       </w:pPr>
       <w:r>
-        <w:t xml:space="preserve">Keep Sai and Siddhardth in separate browser sessions. Retrieve their private synthetic passwords from the ignored local file before sharing or recording the screen.</w:t>
+        <w:t xml:space="preserve">Keep Sai and Siddhardth in separate browser sessions. Use the quick-test button for each profile; no credentials need to appear on screen.</w:t>
       </w:r>
     </w:p>
     <w:p>

</xml_diff>